<commit_message>
feat: ESTUDIO SISTEMAS OPERATIVOS HASTA SEMANA 10
</commit_message>
<xml_diff>
--- a/CICLO_V/SISTEMAS_OPERATIVOS/SEMANA_9/Práctica Dirigida Gestion de Usuario en Linux.docx
+++ b/CICLO_V/SISTEMAS_OPERATIVOS/SEMANA_9/Práctica Dirigida Gestion de Usuario en Linux.docx
@@ -1,6 +1,6 @@
 
 <file path=word/document.xml><?xml version="1.0" encoding="utf-8"?>
-<w:document xmlns:wpc="http://schemas.microsoft.com/office/word/2010/wordprocessingCanvas" xmlns:cx="http://schemas.microsoft.com/office/drawing/2014/chartex" xmlns:cx1="http://schemas.microsoft.com/office/drawing/2015/9/8/chartex" xmlns:cx2="http://schemas.microsoft.com/office/drawing/2015/10/21/chartex" xmlns:cx3="http://schemas.microsoft.com/office/drawing/2016/5/9/chartex" xmlns:cx4="http://schemas.microsoft.com/office/drawing/2016/5/10/chartex" xmlns:cx5="http://schemas.microsoft.com/office/drawing/2016/5/11/chartex" xmlns:cx6="http://schemas.microsoft.com/office/drawing/2016/5/12/chartex" xmlns:cx7="http://schemas.microsoft.com/office/drawing/2016/5/13/chartex" xmlns:cx8="http://schemas.microsoft.com/office/drawing/2016/5/14/chartex" xmlns:mc="http://schemas.openxmlformats.org/markup-compatibility/2006" xmlns:aink="http://schemas.microsoft.com/office/drawing/2016/ink" xmlns:am3d="http://schemas.microsoft.com/office/drawing/2017/model3d" xmlns:o="urn:schemas-microsoft-com:office:office" xmlns:oel="http://schemas.microsoft.com/office/2019/extlst" xmlns:r="http://schemas.openxmlformats.org/officeDocument/2006/relationships" xmlns:m="http://schemas.openxmlformats.org/officeDocument/2006/math" xmlns:v="urn:schemas-microsoft-com:vml" xmlns:wp14="http://schemas.microsoft.com/office/word/2010/wordprocessingDrawing" xmlns:wp="http://schemas.openxmlformats.org/drawingml/2006/wordprocessingDrawing" xmlns:w10="urn:schemas-microsoft-com:office:word" xmlns:w="http://schemas.openxmlformats.org/wordprocessingml/2006/main" xmlns:w14="http://schemas.microsoft.com/office/word/2010/wordml" xmlns:w15="http://schemas.microsoft.com/office/word/2012/wordml" xmlns:w16cex="http://schemas.microsoft.com/office/word/2018/wordml/cex" xmlns:w16cid="http://schemas.microsoft.com/office/word/2016/wordml/cid" xmlns:w16="http://schemas.microsoft.com/office/word/2018/wordml" xmlns:w16du="http://schemas.microsoft.com/office/word/2023/wordml/word16du" xmlns:w16sdtdh="http://schemas.microsoft.com/office/word/2020/wordml/sdtdatahash" xmlns:w16sdtfl="http://schemas.microsoft.com/office/word/2024/wordml/sdtformatlock" xmlns:w16se="http://schemas.microsoft.com/office/word/2015/wordml/symex" xmlns:wpg="http://schemas.microsoft.com/office/word/2010/wordprocessingGroup" xmlns:wpi="http://schemas.microsoft.com/office/word/2010/wordprocessingInk" xmlns:wne="http://schemas.microsoft.com/office/word/2006/wordml" xmlns:wps="http://schemas.microsoft.com/office/word/2010/wordprocessingShape" mc:Ignorable="w14 w15 w16se w16cid w16 w16cex w16sdtdh w16sdtfl w16du wp14">
+<w:document xmlns:wpc="http://schemas.microsoft.com/office/word/2010/wordprocessingCanvas" xmlns:cx="http://schemas.microsoft.com/office/drawing/2014/chartex" xmlns:cx1="http://schemas.microsoft.com/office/drawing/2015/9/8/chartex" xmlns:cx2="http://schemas.microsoft.com/office/drawing/2015/10/21/chartex" xmlns:cx3="http://schemas.microsoft.com/office/drawing/2016/5/9/chartex" xmlns:cx4="http://schemas.microsoft.com/office/drawing/2016/5/10/chartex" xmlns:cx5="http://schemas.microsoft.com/office/drawing/2016/5/11/chartex" xmlns:cx6="http://schemas.microsoft.com/office/drawing/2016/5/12/chartex" xmlns:cx7="http://schemas.microsoft.com/office/drawing/2016/5/13/chartex" xmlns:cx8="http://schemas.microsoft.com/office/drawing/2016/5/14/chartex" xmlns:mc="http://schemas.openxmlformats.org/markup-compatibility/2006" xmlns:aink="http://schemas.microsoft.com/office/drawing/2016/ink" xmlns:am3d="http://schemas.microsoft.com/office/drawing/2017/model3d" xmlns:o="urn:schemas-microsoft-com:office:office" xmlns:oel="http://schemas.microsoft.com/office/2019/extlst" xmlns:r="http://schemas.openxmlformats.org/officeDocument/2006/relationships" xmlns:m="http://schemas.openxmlformats.org/officeDocument/2006/math" xmlns:v="urn:schemas-microsoft-com:vml" xmlns:wp14="http://schemas.microsoft.com/office/word/2010/wordprocessingDrawing" xmlns:wp="http://schemas.openxmlformats.org/drawingml/2006/wordprocessingDrawing" xmlns:w10="urn:schemas-microsoft-com:office:word" xmlns:w="http://schemas.openxmlformats.org/wordprocessingml/2006/main" xmlns:w14="http://schemas.microsoft.com/office/word/2010/wordml" xmlns:w15="http://schemas.microsoft.com/office/word/2012/wordml" xmlns:w16cex="http://schemas.microsoft.com/office/word/2018/wordml/cex" xmlns:w16cid="http://schemas.microsoft.com/office/word/2016/wordml/cid" xmlns:w16="http://schemas.microsoft.com/office/word/2018/wordml" xmlns:w16sdtdh="http://schemas.microsoft.com/office/word/2020/wordml/sdtdatahash" xmlns:w16se="http://schemas.microsoft.com/office/word/2015/wordml/symex" xmlns:wpg="http://schemas.microsoft.com/office/word/2010/wordprocessingGroup" xmlns:wpi="http://schemas.microsoft.com/office/word/2010/wordprocessingInk" xmlns:wne="http://schemas.microsoft.com/office/word/2006/wordml" xmlns:wps="http://schemas.microsoft.com/office/word/2010/wordprocessingShape" mc:Ignorable="w14 w15 w16se w16cid w16 w16cex w16sdtdh wp14">
   <w:body>
     <w:p>
       <w:pPr>
@@ -347,11 +347,9 @@
             <w:hideMark/>
           </w:tcPr>
           <w:p>
-            <w:proofErr w:type="spellStart"/>
             <w:r>
               <w:t>adduser</w:t>
             </w:r>
-            <w:proofErr w:type="spellEnd"/>
           </w:p>
         </w:tc>
         <w:tc>
@@ -378,11 +376,9 @@
             <w:hideMark/>
           </w:tcPr>
           <w:p>
-            <w:proofErr w:type="spellStart"/>
             <w:r>
               <w:t>usermod</w:t>
             </w:r>
-            <w:proofErr w:type="spellEnd"/>
           </w:p>
         </w:tc>
         <w:tc>
@@ -409,12 +405,10 @@
             <w:hideMark/>
           </w:tcPr>
           <w:p>
-            <w:proofErr w:type="spellStart"/>
             <w:r>
               <w:lastRenderedPageBreak/>
               <w:t>deluser</w:t>
             </w:r>
-            <w:proofErr w:type="spellEnd"/>
           </w:p>
         </w:tc>
         <w:tc>
@@ -441,11 +435,9 @@
             <w:hideMark/>
           </w:tcPr>
           <w:p>
-            <w:proofErr w:type="spellStart"/>
             <w:r>
               <w:t>passwd</w:t>
             </w:r>
-            <w:proofErr w:type="spellEnd"/>
           </w:p>
         </w:tc>
         <w:tc>
@@ -472,11 +464,9 @@
             <w:hideMark/>
           </w:tcPr>
           <w:p>
-            <w:proofErr w:type="spellStart"/>
             <w:r>
               <w:t>addgroup</w:t>
             </w:r>
-            <w:proofErr w:type="spellEnd"/>
           </w:p>
         </w:tc>
         <w:tc>
@@ -503,11 +493,9 @@
             <w:hideMark/>
           </w:tcPr>
           <w:p>
-            <w:proofErr w:type="spellStart"/>
             <w:r>
               <w:t>groupmod</w:t>
             </w:r>
-            <w:proofErr w:type="spellEnd"/>
           </w:p>
         </w:tc>
         <w:tc>
@@ -534,11 +522,9 @@
             <w:hideMark/>
           </w:tcPr>
           <w:p>
-            <w:proofErr w:type="spellStart"/>
             <w:r>
               <w:t>gpasswd</w:t>
             </w:r>
-            <w:proofErr w:type="spellEnd"/>
           </w:p>
         </w:tc>
         <w:tc>
@@ -565,11 +551,9 @@
             <w:hideMark/>
           </w:tcPr>
           <w:p>
-            <w:proofErr w:type="spellStart"/>
             <w:r>
               <w:t>whoami</w:t>
             </w:r>
-            <w:proofErr w:type="spellEnd"/>
           </w:p>
         </w:tc>
         <w:tc>
@@ -596,11 +580,9 @@
             <w:hideMark/>
           </w:tcPr>
           <w:p>
-            <w:proofErr w:type="spellStart"/>
             <w:r>
               <w:t>groups</w:t>
             </w:r>
-            <w:proofErr w:type="spellEnd"/>
           </w:p>
         </w:tc>
         <w:tc>
@@ -637,21 +619,12 @@
       <w:r>
         <w:t xml:space="preserve">La empresa </w:t>
       </w:r>
-      <w:proofErr w:type="spellStart"/>
-      <w:r>
-        <w:rPr>
-          <w:b/>
-          <w:bCs/>
-        </w:rPr>
-        <w:t>TechSolutions</w:t>
-      </w:r>
-      <w:proofErr w:type="spellEnd"/>
-      <w:r>
-        <w:rPr>
-          <w:b/>
-          <w:bCs/>
-        </w:rPr>
-        <w:t xml:space="preserve"> SAC</w:t>
+      <w:r>
+        <w:rPr>
+          <w:b/>
+          <w:bCs/>
+        </w:rPr>
+        <w:t>TechSolutions SAC</w:t>
       </w:r>
       <w:r>
         <w:t xml:space="preserve"> necesita organizar su servidor Linux para administrar correctamente a sus trabajadores del área de desarrollo.</w:t>
@@ -795,11 +768,9 @@
       </w:r>
     </w:p>
     <w:p>
-      <w:proofErr w:type="spellStart"/>
       <w:r>
         <w:t>whoami</w:t>
       </w:r>
-      <w:proofErr w:type="spellEnd"/>
     </w:p>
     <w:p>
       <w:pPr>
@@ -847,15 +818,7 @@
         </w:numPr>
       </w:pPr>
       <w:r>
-        <w:t xml:space="preserve">¿Qué diferencia existe entre usuario normal y </w:t>
-      </w:r>
-      <w:proofErr w:type="spellStart"/>
-      <w:r>
-        <w:t>root</w:t>
-      </w:r>
-      <w:proofErr w:type="spellEnd"/>
-      <w:r>
-        <w:t xml:space="preserve">? </w:t>
+        <w:t xml:space="preserve">¿Qué diferencia existe entre usuario normal y root? </w:t>
       </w:r>
     </w:p>
     <w:p>
@@ -943,15 +906,7 @@
     </w:p>
     <w:p>
       <w:r>
-        <w:t xml:space="preserve">sudo </w:t>
-      </w:r>
-      <w:proofErr w:type="spellStart"/>
-      <w:r>
-        <w:t>adduser</w:t>
-      </w:r>
-      <w:proofErr w:type="spellEnd"/>
-      <w:r>
-        <w:t xml:space="preserve"> developer1</w:t>
+        <w:t>sudo adduser developer1</w:t>
       </w:r>
     </w:p>
     <w:p>
@@ -1075,13 +1030,8 @@
           <w:numId w:val="8"/>
         </w:numPr>
       </w:pPr>
-      <w:proofErr w:type="spellStart"/>
-      <w:r>
-        <w:t>devteam</w:t>
-      </w:r>
-      <w:proofErr w:type="spellEnd"/>
-      <w:r>
-        <w:t xml:space="preserve"> </w:t>
+      <w:r>
+        <w:t xml:space="preserve">devteam </w:t>
       </w:r>
     </w:p>
     <w:p>
@@ -1112,21 +1062,8 @@
     </w:p>
     <w:p>
       <w:r>
-        <w:t xml:space="preserve">sudo </w:t>
-      </w:r>
-      <w:proofErr w:type="spellStart"/>
-      <w:r>
-        <w:t>addgroup</w:t>
-      </w:r>
-      <w:proofErr w:type="spellEnd"/>
-      <w:r>
-        <w:t xml:space="preserve"> </w:t>
-      </w:r>
-      <w:proofErr w:type="spellStart"/>
-      <w:r>
-        <w:t>devteam</w:t>
-      </w:r>
-      <w:proofErr w:type="spellEnd"/>
+        <w:t>sudo addgroup devteam</w:t>
+      </w:r>
     </w:p>
     <w:p>
       <w:pPr>
@@ -1246,11 +1183,9 @@
             <w:hideMark/>
           </w:tcPr>
           <w:p>
-            <w:proofErr w:type="spellStart"/>
             <w:r>
               <w:t>devteam</w:t>
             </w:r>
-            <w:proofErr w:type="spellEnd"/>
           </w:p>
         </w:tc>
       </w:tr>
@@ -1277,11 +1212,9 @@
             <w:hideMark/>
           </w:tcPr>
           <w:p>
-            <w:proofErr w:type="spellStart"/>
             <w:r>
               <w:t>devteam</w:t>
             </w:r>
-            <w:proofErr w:type="spellEnd"/>
           </w:p>
         </w:tc>
       </w:tr>
@@ -1332,31 +1265,7 @@
     </w:p>
     <w:p>
       <w:r>
-        <w:t xml:space="preserve">sudo </w:t>
-      </w:r>
-      <w:proofErr w:type="spellStart"/>
-      <w:r>
-        <w:t>usermod</w:t>
-      </w:r>
-      <w:proofErr w:type="spellEnd"/>
-      <w:r>
-        <w:t xml:space="preserve"> -</w:t>
-      </w:r>
-      <w:proofErr w:type="spellStart"/>
-      <w:r>
-        <w:t>aG</w:t>
-      </w:r>
-      <w:proofErr w:type="spellEnd"/>
-      <w:r>
-        <w:t xml:space="preserve"> </w:t>
-      </w:r>
-      <w:proofErr w:type="spellStart"/>
-      <w:r>
-        <w:t>devteam</w:t>
-      </w:r>
-      <w:proofErr w:type="spellEnd"/>
-      <w:r>
-        <w:t xml:space="preserve"> developer1</w:t>
+        <w:t>sudo usermod -aG devteam developer1</w:t>
       </w:r>
     </w:p>
     <w:p>
@@ -1375,13 +1284,8 @@
       </w:r>
     </w:p>
     <w:p>
-      <w:proofErr w:type="spellStart"/>
-      <w:r>
-        <w:t>groups</w:t>
-      </w:r>
-      <w:proofErr w:type="spellEnd"/>
-      <w:r>
-        <w:t xml:space="preserve"> developer1</w:t>
+      <w:r>
+        <w:t>groups developer1</w:t>
       </w:r>
     </w:p>
     <w:p>
@@ -1407,15 +1311,7 @@
         </w:numPr>
       </w:pPr>
       <w:r>
-        <w:t>¿Qué significa -</w:t>
-      </w:r>
-      <w:proofErr w:type="spellStart"/>
-      <w:r>
-        <w:t>aG</w:t>
-      </w:r>
-      <w:proofErr w:type="spellEnd"/>
-      <w:r>
-        <w:t xml:space="preserve">? </w:t>
+        <w:t xml:space="preserve">¿Qué significa -aG? </w:t>
       </w:r>
     </w:p>
     <w:p>
@@ -1481,15 +1377,7 @@
     </w:p>
     <w:p>
       <w:r>
-        <w:t xml:space="preserve">sudo </w:t>
-      </w:r>
-      <w:proofErr w:type="spellStart"/>
-      <w:r>
-        <w:t>passwd</w:t>
-      </w:r>
-      <w:proofErr w:type="spellEnd"/>
-      <w:r>
-        <w:t xml:space="preserve"> developer1</w:t>
+        <w:t>sudo passwd developer1</w:t>
       </w:r>
     </w:p>
     <w:p>
@@ -1509,15 +1397,7 @@
     </w:p>
     <w:p>
       <w:r>
-        <w:t xml:space="preserve">Cambiar el nombre del grupo </w:t>
-      </w:r>
-      <w:proofErr w:type="spellStart"/>
-      <w:r>
-        <w:t>devteam</w:t>
-      </w:r>
-      <w:proofErr w:type="spellEnd"/>
-      <w:r>
-        <w:t xml:space="preserve"> por desarrolladores.</w:t>
+        <w:t>Cambiar el nombre del grupo devteam por desarrolladores.</w:t>
       </w:r>
     </w:p>
     <w:p>
@@ -1537,21 +1417,8 @@
     </w:p>
     <w:p>
       <w:r>
-        <w:t xml:space="preserve">sudo </w:t>
-      </w:r>
-      <w:proofErr w:type="spellStart"/>
-      <w:r>
-        <w:t>groupmod</w:t>
-      </w:r>
-      <w:proofErr w:type="spellEnd"/>
-      <w:r>
-        <w:t xml:space="preserve"> -n desarrolladores </w:t>
-      </w:r>
-      <w:proofErr w:type="spellStart"/>
-      <w:r>
-        <w:t>devteam</w:t>
-      </w:r>
-      <w:proofErr w:type="spellEnd"/>
+        <w:t>sudo groupmod -n desarrolladores devteam</w:t>
+      </w:r>
     </w:p>
     <w:p>
       <w:pPr>
@@ -1627,15 +1494,7 @@
     </w:p>
     <w:p>
       <w:r>
-        <w:t xml:space="preserve">sudo </w:t>
-      </w:r>
-      <w:proofErr w:type="spellStart"/>
-      <w:r>
-        <w:t>gpasswd</w:t>
-      </w:r>
-      <w:proofErr w:type="spellEnd"/>
-      <w:r>
-        <w:t xml:space="preserve"> -a developer1 desarrolladores</w:t>
+        <w:t>sudo gpasswd -a developer1 desarrolladores</w:t>
       </w:r>
     </w:p>
     <w:p>
@@ -1660,13 +1519,8 @@
       </w:r>
     </w:p>
     <w:p>
-      <w:proofErr w:type="spellStart"/>
-      <w:r>
-        <w:t>groups</w:t>
-      </w:r>
-      <w:proofErr w:type="spellEnd"/>
-      <w:r>
-        <w:t xml:space="preserve"> developer1</w:t>
+      <w:r>
+        <w:t>groups developer1</w:t>
       </w:r>
     </w:p>
     <w:p>
@@ -1706,23 +1560,7 @@
     </w:p>
     <w:p>
       <w:r>
-        <w:t xml:space="preserve">sudo </w:t>
-      </w:r>
-      <w:proofErr w:type="spellStart"/>
-      <w:r>
-        <w:t>deluser</w:t>
-      </w:r>
-      <w:proofErr w:type="spellEnd"/>
-      <w:r>
-        <w:t xml:space="preserve"> --</w:t>
-      </w:r>
-      <w:proofErr w:type="spellStart"/>
-      <w:r>
-        <w:t>remove</w:t>
-      </w:r>
-      <w:proofErr w:type="spellEnd"/>
-      <w:r>
-        <w:t>-home soporte1</w:t>
+        <w:t>sudo deluser --remove-home soporte1</w:t>
       </w:r>
     </w:p>
     <w:p>
@@ -1748,15 +1586,7 @@
         </w:numPr>
       </w:pPr>
       <w:r>
-        <w:t>¿Qué hace la opción --</w:t>
-      </w:r>
-      <w:proofErr w:type="spellStart"/>
-      <w:r>
-        <w:t>remove</w:t>
-      </w:r>
-      <w:proofErr w:type="spellEnd"/>
-      <w:r>
-        <w:t xml:space="preserve">-home? </w:t>
+        <w:t xml:space="preserve">¿Qué hace la opción --remove-home? </w:t>
       </w:r>
     </w:p>
     <w:p>
@@ -1855,15 +1685,7 @@
         </w:numPr>
       </w:pPr>
       <w:r>
-        <w:t xml:space="preserve">¿Cuál es la función de </w:t>
-      </w:r>
-      <w:proofErr w:type="spellStart"/>
-      <w:r>
-        <w:t>adduser</w:t>
-      </w:r>
-      <w:proofErr w:type="spellEnd"/>
-      <w:r>
-        <w:t xml:space="preserve">? </w:t>
+        <w:t xml:space="preserve">¿Cuál es la función de adduser? </w:t>
       </w:r>
     </w:p>
     <w:p>
@@ -1874,15 +1696,7 @@
         </w:numPr>
       </w:pPr>
       <w:r>
-        <w:t xml:space="preserve">¿Para qué sirve </w:t>
-      </w:r>
-      <w:proofErr w:type="spellStart"/>
-      <w:r>
-        <w:t>groups</w:t>
-      </w:r>
-      <w:proofErr w:type="spellEnd"/>
-      <w:r>
-        <w:t xml:space="preserve">? </w:t>
+        <w:t xml:space="preserve">¿Para qué sirve groups? </w:t>
       </w:r>
     </w:p>
     <w:p>
@@ -1893,23 +1707,7 @@
         </w:numPr>
       </w:pPr>
       <w:r>
-        <w:t xml:space="preserve">¿Qué diferencia existe entre </w:t>
-      </w:r>
-      <w:proofErr w:type="spellStart"/>
-      <w:r>
-        <w:t>groupmod</w:t>
-      </w:r>
-      <w:proofErr w:type="spellEnd"/>
-      <w:r>
-        <w:t xml:space="preserve"> y </w:t>
-      </w:r>
-      <w:proofErr w:type="spellStart"/>
-      <w:r>
-        <w:t>gpasswd</w:t>
-      </w:r>
-      <w:proofErr w:type="spellEnd"/>
-      <w:r>
-        <w:t xml:space="preserve">? </w:t>
+        <w:t xml:space="preserve">¿Qué diferencia existe entre groupmod y gpasswd? </w:t>
       </w:r>
     </w:p>
     <w:p>
@@ -2208,6 +2006,203 @@
       </w:tr>
     </w:tbl>
     <w:p/>
+    <w:p>
+      <w:r>
+        <w:rPr>
+          <w:noProof/>
+        </w:rPr>
+        <mc:AlternateContent>
+          <mc:Choice Requires="wps">
+            <w:drawing>
+              <wp:inline distT="0" distB="0" distL="0" distR="0" wp14:anchorId="525F7161" wp14:editId="45206AF8">
+                <wp:extent cx="304800" cy="304800"/>
+                <wp:effectExtent l="0" t="0" r="0" b="0"/>
+                <wp:docPr id="1" name="Rectángulo 1"/>
+                <wp:cNvGraphicFramePr>
+                  <a:graphicFrameLocks xmlns:a="http://schemas.openxmlformats.org/drawingml/2006/main" noChangeAspect="1"/>
+                </wp:cNvGraphicFramePr>
+                <a:graphic xmlns:a="http://schemas.openxmlformats.org/drawingml/2006/main">
+                  <a:graphicData uri="http://schemas.microsoft.com/office/word/2010/wordprocessingShape">
+                    <wps:wsp>
+                      <wps:cNvSpPr>
+                        <a:spLocks noChangeAspect="1" noChangeArrowheads="1"/>
+                      </wps:cNvSpPr>
+                      <wps:spPr bwMode="auto">
+                        <a:xfrm>
+                          <a:off x="0" y="0"/>
+                          <a:ext cx="304800" cy="304800"/>
+                        </a:xfrm>
+                        <a:prstGeom prst="rect">
+                          <a:avLst/>
+                        </a:prstGeom>
+                        <a:noFill/>
+                        <a:ln>
+                          <a:noFill/>
+                        </a:ln>
+                        <a:extLst>
+                          <a:ext uri="{909E8E84-426E-40DD-AFC4-6F175D3DCCD1}">
+                            <a14:hiddenFill xmlns:a14="http://schemas.microsoft.com/office/drawing/2010/main">
+                              <a:solidFill>
+                                <a:srgbClr val="FFFFFF"/>
+                              </a:solidFill>
+                            </a14:hiddenFill>
+                          </a:ext>
+                          <a:ext uri="{91240B29-F687-4F45-9708-019B960494DF}">
+                            <a14:hiddenLine xmlns:a14="http://schemas.microsoft.com/office/drawing/2010/main" w="9525">
+                              <a:solidFill>
+                                <a:srgbClr val="000000"/>
+                              </a:solidFill>
+                              <a:miter lim="800000"/>
+                              <a:headEnd/>
+                              <a:tailEnd/>
+                            </a14:hiddenLine>
+                          </a:ext>
+                        </a:extLst>
+                      </wps:spPr>
+                      <wps:bodyPr rot="0" vert="horz" wrap="square" lIns="91440" tIns="45720" rIns="91440" bIns="45720" anchor="t" anchorCtr="0" upright="1">
+                        <a:noAutofit/>
+                      </wps:bodyPr>
+                    </wps:wsp>
+                  </a:graphicData>
+                </a:graphic>
+              </wp:inline>
+            </w:drawing>
+          </mc:Choice>
+          <mc:Fallback>
+            <w:pict>
+              <v:rect w14:anchorId="130A9A4A" id="Rectángulo 1" o:spid="_x0000_s1026" style="width:24pt;height:24pt;visibility:visible;mso-wrap-style:square;mso-left-percent:-10001;mso-top-percent:-10001;mso-position-horizontal:absolute;mso-position-horizontal-relative:char;mso-position-vertical:absolute;mso-position-vertical-relative:line;mso-left-percent:-10001;mso-top-percent:-10001;v-text-anchor:top" o:gfxdata="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" filled="f" stroked="f">
+                <o:lock v:ext="edit" aspectratio="t"/>
+                <w10:anchorlock/>
+              </v:rect>
+            </w:pict>
+          </mc:Fallback>
+        </mc:AlternateContent>
+      </w:r>
+      <w:r>
+        <w:drawing>
+          <wp:inline distT="0" distB="0" distL="0" distR="0" wp14:anchorId="1F3B87DC" wp14:editId="49D7BB6B">
+            <wp:extent cx="4153260" cy="4701947"/>
+            <wp:effectExtent l="0" t="0" r="0" b="3810"/>
+            <wp:docPr id="3" name="Imagen 3"/>
+            <wp:cNvGraphicFramePr>
+              <a:graphicFrameLocks xmlns:a="http://schemas.openxmlformats.org/drawingml/2006/main" noChangeAspect="1"/>
+            </wp:cNvGraphicFramePr>
+            <a:graphic xmlns:a="http://schemas.openxmlformats.org/drawingml/2006/main">
+              <a:graphicData uri="http://schemas.openxmlformats.org/drawingml/2006/picture">
+                <pic:pic xmlns:pic="http://schemas.openxmlformats.org/drawingml/2006/picture">
+                  <pic:nvPicPr>
+                    <pic:cNvPr id="1" name=""/>
+                    <pic:cNvPicPr/>
+                  </pic:nvPicPr>
+                  <pic:blipFill>
+                    <a:blip r:embed="rId5"/>
+                    <a:stretch>
+                      <a:fillRect/>
+                    </a:stretch>
+                  </pic:blipFill>
+                  <pic:spPr>
+                    <a:xfrm>
+                      <a:off x="0" y="0"/>
+                      <a:ext cx="4153260" cy="4701947"/>
+                    </a:xfrm>
+                    <a:prstGeom prst="rect">
+                      <a:avLst/>
+                    </a:prstGeom>
+                  </pic:spPr>
+                </pic:pic>
+              </a:graphicData>
+            </a:graphic>
+          </wp:inline>
+        </w:drawing>
+      </w:r>
+    </w:p>
+    <w:p/>
+    <w:p/>
+    <w:p>
+      <w:r>
+        <w:br w:type="page"/>
+      </w:r>
+    </w:p>
+    <w:p>
+      <w:r>
+        <w:lastRenderedPageBreak/>
+        <w:drawing>
+          <wp:inline distT="0" distB="0" distL="0" distR="0" wp14:anchorId="6C8A936B" wp14:editId="1B466DC1">
+            <wp:extent cx="4198984" cy="4663844"/>
+            <wp:effectExtent l="0" t="0" r="0" b="3810"/>
+            <wp:docPr id="4" name="Imagen 4"/>
+            <wp:cNvGraphicFramePr>
+              <a:graphicFrameLocks xmlns:a="http://schemas.openxmlformats.org/drawingml/2006/main" noChangeAspect="1"/>
+            </wp:cNvGraphicFramePr>
+            <a:graphic xmlns:a="http://schemas.openxmlformats.org/drawingml/2006/main">
+              <a:graphicData uri="http://schemas.openxmlformats.org/drawingml/2006/picture">
+                <pic:pic xmlns:pic="http://schemas.openxmlformats.org/drawingml/2006/picture">
+                  <pic:nvPicPr>
+                    <pic:cNvPr id="1" name=""/>
+                    <pic:cNvPicPr/>
+                  </pic:nvPicPr>
+                  <pic:blipFill>
+                    <a:blip r:embed="rId6"/>
+                    <a:stretch>
+                      <a:fillRect/>
+                    </a:stretch>
+                  </pic:blipFill>
+                  <pic:spPr>
+                    <a:xfrm>
+                      <a:off x="0" y="0"/>
+                      <a:ext cx="4198984" cy="4663844"/>
+                    </a:xfrm>
+                    <a:prstGeom prst="rect">
+                      <a:avLst/>
+                    </a:prstGeom>
+                  </pic:spPr>
+                </pic:pic>
+              </a:graphicData>
+            </a:graphic>
+          </wp:inline>
+        </w:drawing>
+      </w:r>
+    </w:p>
+    <w:p>
+      <w:r>
+        <w:lastRenderedPageBreak/>
+        <w:drawing>
+          <wp:inline distT="0" distB="0" distL="0" distR="0" wp14:anchorId="351471DC" wp14:editId="6C60C881">
+            <wp:extent cx="3711262" cy="4557155"/>
+            <wp:effectExtent l="0" t="0" r="3810" b="0"/>
+            <wp:docPr id="5" name="Imagen 5"/>
+            <wp:cNvGraphicFramePr>
+              <a:graphicFrameLocks xmlns:a="http://schemas.openxmlformats.org/drawingml/2006/main" noChangeAspect="1"/>
+            </wp:cNvGraphicFramePr>
+            <a:graphic xmlns:a="http://schemas.openxmlformats.org/drawingml/2006/main">
+              <a:graphicData uri="http://schemas.openxmlformats.org/drawingml/2006/picture">
+                <pic:pic xmlns:pic="http://schemas.openxmlformats.org/drawingml/2006/picture">
+                  <pic:nvPicPr>
+                    <pic:cNvPr id="1" name=""/>
+                    <pic:cNvPicPr/>
+                  </pic:nvPicPr>
+                  <pic:blipFill>
+                    <a:blip r:embed="rId7"/>
+                    <a:stretch>
+                      <a:fillRect/>
+                    </a:stretch>
+                  </pic:blipFill>
+                  <pic:spPr>
+                    <a:xfrm>
+                      <a:off x="0" y="0"/>
+                      <a:ext cx="3711262" cy="4557155"/>
+                    </a:xfrm>
+                    <a:prstGeom prst="rect">
+                      <a:avLst/>
+                    </a:prstGeom>
+                  </pic:spPr>
+                </pic:pic>
+              </a:graphicData>
+            </a:graphic>
+          </wp:inline>
+        </w:drawing>
+      </w:r>
+    </w:p>
     <w:sectPr>
       <w:pgSz w:w="11906" w:h="16838" w:code="9"/>
       <w:pgMar w:top="1417" w:right="1701" w:bottom="1417" w:left="1701" w:header="709" w:footer="709" w:gutter="0"/>
@@ -2220,7 +2215,7 @@
 </file>
 
 <file path=word/numbering.xml><?xml version="1.0" encoding="utf-8"?>
-<w:numbering xmlns:wpc="http://schemas.microsoft.com/office/word/2010/wordprocessingCanvas" xmlns:cx="http://schemas.microsoft.com/office/drawing/2014/chartex" xmlns:cx1="http://schemas.microsoft.com/office/drawing/2015/9/8/chartex" xmlns:cx2="http://schemas.microsoft.com/office/drawing/2015/10/21/chartex" xmlns:cx3="http://schemas.microsoft.com/office/drawing/2016/5/9/chartex" xmlns:cx4="http://schemas.microsoft.com/office/drawing/2016/5/10/chartex" xmlns:cx5="http://schemas.microsoft.com/office/drawing/2016/5/11/chartex" xmlns:cx6="http://schemas.microsoft.com/office/drawing/2016/5/12/chartex" xmlns:cx7="http://schemas.microsoft.com/office/drawing/2016/5/13/chartex" xmlns:cx8="http://schemas.microsoft.com/office/drawing/2016/5/14/chartex" xmlns:mc="http://schemas.openxmlformats.org/markup-compatibility/2006" xmlns:aink="http://schemas.microsoft.com/office/drawing/2016/ink" xmlns:am3d="http://schemas.microsoft.com/office/drawing/2017/model3d" xmlns:o="urn:schemas-microsoft-com:office:office" xmlns:oel="http://schemas.microsoft.com/office/2019/extlst" xmlns:r="http://schemas.openxmlformats.org/officeDocument/2006/relationships" xmlns:m="http://schemas.openxmlformats.org/officeDocument/2006/math" xmlns:v="urn:schemas-microsoft-com:vml" xmlns:wp14="http://schemas.microsoft.com/office/word/2010/wordprocessingDrawing" xmlns:wp="http://schemas.openxmlformats.org/drawingml/2006/wordprocessingDrawing" xmlns:w10="urn:schemas-microsoft-com:office:word" xmlns:w="http://schemas.openxmlformats.org/wordprocessingml/2006/main" xmlns:w14="http://schemas.microsoft.com/office/word/2010/wordml" xmlns:w15="http://schemas.microsoft.com/office/word/2012/wordml" xmlns:w16cex="http://schemas.microsoft.com/office/word/2018/wordml/cex" xmlns:w16cid="http://schemas.microsoft.com/office/word/2016/wordml/cid" xmlns:w16="http://schemas.microsoft.com/office/word/2018/wordml" xmlns:w16du="http://schemas.microsoft.com/office/word/2023/wordml/word16du" xmlns:w16sdtdh="http://schemas.microsoft.com/office/word/2020/wordml/sdtdatahash" xmlns:w16sdtfl="http://schemas.microsoft.com/office/word/2024/wordml/sdtformatlock" xmlns:w16se="http://schemas.microsoft.com/office/word/2015/wordml/symex" xmlns:wpg="http://schemas.microsoft.com/office/word/2010/wordprocessingGroup" xmlns:wpi="http://schemas.microsoft.com/office/word/2010/wordprocessingInk" xmlns:wne="http://schemas.microsoft.com/office/word/2006/wordml" xmlns:wps="http://schemas.microsoft.com/office/word/2010/wordprocessingShape" mc:Ignorable="w14 w15 w16se w16cid w16 w16cex w16sdtdh w16sdtfl w16du wp14">
+<w:numbering xmlns:wpc="http://schemas.microsoft.com/office/word/2010/wordprocessingCanvas" xmlns:cx="http://schemas.microsoft.com/office/drawing/2014/chartex" xmlns:cx1="http://schemas.microsoft.com/office/drawing/2015/9/8/chartex" xmlns:cx2="http://schemas.microsoft.com/office/drawing/2015/10/21/chartex" xmlns:cx3="http://schemas.microsoft.com/office/drawing/2016/5/9/chartex" xmlns:cx4="http://schemas.microsoft.com/office/drawing/2016/5/10/chartex" xmlns:cx5="http://schemas.microsoft.com/office/drawing/2016/5/11/chartex" xmlns:cx6="http://schemas.microsoft.com/office/drawing/2016/5/12/chartex" xmlns:cx7="http://schemas.microsoft.com/office/drawing/2016/5/13/chartex" xmlns:cx8="http://schemas.microsoft.com/office/drawing/2016/5/14/chartex" xmlns:mc="http://schemas.openxmlformats.org/markup-compatibility/2006" xmlns:aink="http://schemas.microsoft.com/office/drawing/2016/ink" xmlns:am3d="http://schemas.microsoft.com/office/drawing/2017/model3d" xmlns:o="urn:schemas-microsoft-com:office:office" xmlns:oel="http://schemas.microsoft.com/office/2019/extlst" xmlns:r="http://schemas.openxmlformats.org/officeDocument/2006/relationships" xmlns:m="http://schemas.openxmlformats.org/officeDocument/2006/math" xmlns:v="urn:schemas-microsoft-com:vml" xmlns:wp14="http://schemas.microsoft.com/office/word/2010/wordprocessingDrawing" xmlns:wp="http://schemas.openxmlformats.org/drawingml/2006/wordprocessingDrawing" xmlns:w10="urn:schemas-microsoft-com:office:word" xmlns:w="http://schemas.openxmlformats.org/wordprocessingml/2006/main" xmlns:w14="http://schemas.microsoft.com/office/word/2010/wordml" xmlns:w15="http://schemas.microsoft.com/office/word/2012/wordml" xmlns:w16cex="http://schemas.microsoft.com/office/word/2018/wordml/cex" xmlns:w16cid="http://schemas.microsoft.com/office/word/2016/wordml/cid" xmlns:w16="http://schemas.microsoft.com/office/word/2018/wordml" xmlns:w16sdtdh="http://schemas.microsoft.com/office/word/2020/wordml/sdtdatahash" xmlns:w16se="http://schemas.microsoft.com/office/word/2015/wordml/symex" xmlns:wpg="http://schemas.microsoft.com/office/word/2010/wordprocessingGroup" xmlns:wpi="http://schemas.microsoft.com/office/word/2010/wordprocessingInk" xmlns:wne="http://schemas.microsoft.com/office/word/2006/wordml" xmlns:wps="http://schemas.microsoft.com/office/word/2010/wordprocessingShape" mc:Ignorable="w14 w15 w16se w16cid w16 w16cex w16sdtdh wp14">
   <w:abstractNum w:abstractNumId="0" w15:restartNumberingAfterBreak="0">
     <w:nsid w:val="036745F6"/>
     <w:multiLevelType w:val="multilevel"/>
@@ -3985,7 +3980,7 @@
 </file>
 
 <file path=word/styles.xml><?xml version="1.0" encoding="utf-8"?>
-<w:styles xmlns:mc="http://schemas.openxmlformats.org/markup-compatibility/2006" xmlns:r="http://schemas.openxmlformats.org/officeDocument/2006/relationships" xmlns:w="http://schemas.openxmlformats.org/wordprocessingml/2006/main" xmlns:w14="http://schemas.microsoft.com/office/word/2010/wordml" xmlns:w15="http://schemas.microsoft.com/office/word/2012/wordml" xmlns:w16cex="http://schemas.microsoft.com/office/word/2018/wordml/cex" xmlns:w16cid="http://schemas.microsoft.com/office/word/2016/wordml/cid" xmlns:w16="http://schemas.microsoft.com/office/word/2018/wordml" xmlns:w16du="http://schemas.microsoft.com/office/word/2023/wordml/word16du" xmlns:w16sdtdh="http://schemas.microsoft.com/office/word/2020/wordml/sdtdatahash" xmlns:w16sdtfl="http://schemas.microsoft.com/office/word/2024/wordml/sdtformatlock" xmlns:w16se="http://schemas.microsoft.com/office/word/2015/wordml/symex" mc:Ignorable="w14 w15 w16se w16cid w16 w16cex w16sdtdh w16sdtfl w16du">
+<w:styles xmlns:mc="http://schemas.openxmlformats.org/markup-compatibility/2006" xmlns:r="http://schemas.openxmlformats.org/officeDocument/2006/relationships" xmlns:w="http://schemas.openxmlformats.org/wordprocessingml/2006/main" xmlns:w14="http://schemas.microsoft.com/office/word/2010/wordml" xmlns:w15="http://schemas.microsoft.com/office/word/2012/wordml" xmlns:w16cex="http://schemas.microsoft.com/office/word/2018/wordml/cex" xmlns:w16cid="http://schemas.microsoft.com/office/word/2016/wordml/cid" xmlns:w16="http://schemas.microsoft.com/office/word/2018/wordml" xmlns:w16sdtdh="http://schemas.microsoft.com/office/word/2020/wordml/sdtdatahash" xmlns:w16se="http://schemas.microsoft.com/office/word/2015/wordml/symex" mc:Ignorable="w14 w15 w16se w16cid w16 w16cex w16sdtdh">
   <w:docDefaults>
     <w:rPrDefault>
       <w:rPr>
@@ -4587,6 +4582,7 @@
   <w:style w:type="character" w:default="1" w:styleId="Fuentedeprrafopredeter">
     <w:name w:val="Default Paragraph Font"/>
     <w:uiPriority w:val="1"/>
+    <w:semiHidden/>
     <w:unhideWhenUsed/>
   </w:style>
   <w:style w:type="table" w:default="1" w:styleId="Tablanormal">

</xml_diff>